<commit_message>
links cz/ua err fix
</commit_message>
<xml_diff>
--- a/2026/03/docx/cs/CV_Ponomarov_Serhii_CNC.docx
+++ b/2026/03/docx/cs/CV_Ponomarov_Serhii_CNC.docx
@@ -91,7 +91,7 @@
                 <wp:anchor allowOverlap="1" behindDoc="0" distB="114300" distT="114300" distL="114300" distR="114300" hidden="0" layoutInCell="1" locked="0" relativeHeight="0" simplePos="0">
                   <wp:simplePos x="0" y="0"/>
                   <wp:positionH relativeFrom="column">
-                    <wp:posOffset>66676</wp:posOffset>
+                    <wp:posOffset>66677</wp:posOffset>
                   </wp:positionH>
                   <wp:positionV relativeFrom="paragraph">
                     <wp:posOffset>267314</wp:posOffset>
@@ -99,12 +99,12 @@
                   <wp:extent cx="1576768" cy="1576768"/>
                   <wp:effectExtent b="0" l="0" r="0" t="0"/>
                   <wp:wrapTopAndBottom distB="114300" distT="114300"/>
-                  <wp:docPr id="2" name="image1.png"/>
+                  <wp:docPr id="1" name="image2.png"/>
                   <a:graphic>
                     <a:graphicData uri="http://schemas.openxmlformats.org/drawingml/2006/picture">
                       <pic:pic>
                         <pic:nvPicPr>
-                          <pic:cNvPr id="0" name="image1.png"/>
+                          <pic:cNvPr id="0" name="image2.png"/>
                           <pic:cNvPicPr preferRelativeResize="0"/>
                         </pic:nvPicPr>
                         <pic:blipFill>
@@ -140,7 +140,7 @@
                 <w:szCs w:val="34"/>
               </w:rPr>
             </w:pPr>
-            <w:bookmarkStart w:colFirst="0" w:colLast="0" w:name="_ivt99niwv3zh" w:id="0"/>
+            <w:bookmarkStart w:colFirst="0" w:colLast="0" w:name="_5r0rmxboova6" w:id="0"/>
             <w:bookmarkEnd w:id="0"/>
             <w:r>
               <w:rPr>
@@ -156,11 +156,6 @@
               <w:br w:type="textWrapping"/>
               <w:t xml:space="preserve">CNC Programátor </w:t>
             </w:r>
-            <w:r>
-              <w:rPr>
-                <w:rtl w:val="0"/>
-              </w:rPr>
-            </w:r>
           </w:p>
           <w:p>
             <w:pPr>
@@ -202,6 +197,11 @@
                 <w:rtl w:val="0"/>
               </w:rPr>
               <w:t xml:space="preserve">ㅡ</w:t>
+            </w:r>
+            <w:r>
+              <w:rPr>
+                <w:rtl w:val="0"/>
+              </w:rPr>
             </w:r>
           </w:p>
           <w:p>
@@ -217,7 +217,7 @@
                 <w:szCs w:val="20"/>
               </w:rPr>
             </w:pPr>
-            <w:bookmarkStart w:colFirst="0" w:colLast="0" w:name="_atrwyoec88ew" w:id="1"/>
+            <w:bookmarkStart w:colFirst="0" w:colLast="0" w:name="_m6msy5x7f4tu" w:id="1"/>
             <w:bookmarkEnd w:id="1"/>
             <w:r>
               <w:rPr>
@@ -279,6 +279,11 @@
                 <w:rtl w:val="0"/>
               </w:rPr>
               <w:t xml:space="preserve">ㅡ</w:t>
+            </w:r>
+            <w:r>
+              <w:rPr>
+                <w:rtl w:val="0"/>
+              </w:rPr>
             </w:r>
           </w:p>
           <w:p>
@@ -294,7 +299,7 @@
                 <w:szCs w:val="20"/>
               </w:rPr>
             </w:pPr>
-            <w:bookmarkStart w:colFirst="0" w:colLast="0" w:name="_sws9b2qx52z2" w:id="2"/>
+            <w:bookmarkStart w:colFirst="0" w:colLast="0" w:name="_xm97p8z5iaa6" w:id="2"/>
             <w:bookmarkEnd w:id="2"/>
             <w:r>
               <w:rPr>
@@ -378,7 +383,7 @@
                 <w:szCs w:val="20"/>
               </w:rPr>
             </w:pPr>
-            <w:bookmarkStart w:colFirst="0" w:colLast="0" w:name="_ss81nkbbtdkg" w:id="3"/>
+            <w:bookmarkStart w:colFirst="0" w:colLast="0" w:name="_1yv25gmpaheg" w:id="3"/>
             <w:bookmarkEnd w:id="3"/>
             <w:r>
               <w:rPr>
@@ -434,7 +439,7 @@
                 <w:rFonts w:ascii="Arial" w:cs="Arial" w:eastAsia="Arial" w:hAnsi="Arial"/>
               </w:rPr>
             </w:pPr>
-            <w:bookmarkStart w:colFirst="0" w:colLast="0" w:name="_ysczocrn4uuz" w:id="4"/>
+            <w:bookmarkStart w:colFirst="0" w:colLast="0" w:name="_36mhwda43qqn" w:id="4"/>
             <w:bookmarkEnd w:id="4"/>
             <w:r>
               <w:rPr>
@@ -442,11 +447,6 @@
                 <w:rtl w:val="0"/>
               </w:rPr>
               <w:t xml:space="preserve">Serhii Ponomarov</w:t>
-            </w:r>
-            <w:r>
-              <w:rPr>
-                <w:rtl w:val="0"/>
-              </w:rPr>
             </w:r>
           </w:p>
           <w:p>
@@ -574,7 +574,7 @@
                 <w:rFonts w:ascii="Arial" w:cs="Arial" w:eastAsia="Arial" w:hAnsi="Arial"/>
               </w:rPr>
             </w:pPr>
-            <w:bookmarkStart w:colFirst="0" w:colLast="0" w:name="_1btop1n1mouc" w:id="5"/>
+            <w:bookmarkStart w:colFirst="0" w:colLast="0" w:name="_k50vl86i8qg9" w:id="5"/>
             <w:bookmarkEnd w:id="5"/>
             <w:r>
               <w:rPr>
@@ -584,12 +584,12 @@
                 <wp:inline distB="114300" distT="114300" distL="114300" distR="114300">
                   <wp:extent cx="3981450" cy="25400"/>
                   <wp:effectExtent b="0" l="0" r="0" t="0"/>
-                  <wp:docPr descr="horizontal line" id="1" name="image2.png"/>
+                  <wp:docPr descr="horizontal line" id="2" name="image1.png"/>
                   <a:graphic>
                     <a:graphicData uri="http://schemas.openxmlformats.org/drawingml/2006/picture">
                       <pic:pic>
                         <pic:nvPicPr>
-                          <pic:cNvPr descr="horizontal line" id="0" name="image2.png"/>
+                          <pic:cNvPr descr="horizontal line" id="0" name="image1.png"/>
                           <pic:cNvPicPr preferRelativeResize="0"/>
                         </pic:nvPicPr>
                         <pic:blipFill>
@@ -834,7 +834,7 @@
           <w:szCs w:val="16"/>
         </w:rPr>
       </w:pPr>
-      <w:bookmarkStart w:colFirst="0" w:colLast="0" w:name="_w63pb9kl6pf" w:id="6"/>
+      <w:bookmarkStart w:colFirst="0" w:colLast="0" w:name="_zgn9h0j5b12q" w:id="6"/>
       <w:bookmarkEnd w:id="6"/>
       <w:r>
         <w:pict>
@@ -858,7 +858,7 @@
           <w:rFonts w:ascii="Arial" w:cs="Arial" w:eastAsia="Arial" w:hAnsi="Arial"/>
         </w:rPr>
       </w:pPr>
-      <w:bookmarkStart w:colFirst="0" w:colLast="0" w:name="_aw5apt3qrwb8" w:id="7"/>
+      <w:bookmarkStart w:colFirst="0" w:colLast="0" w:name="_g927hfkzcz0d" w:id="7"/>
       <w:bookmarkEnd w:id="7"/>
       <w:r>
         <w:rPr>

</xml_diff>